<commit_message>
add validate risk thresholds
</commit_message>
<xml_diff>
--- a/Lightweight Phishing Detection planing.docx
+++ b/Lightweight Phishing Detection planing.docx
@@ -69,15 +69,7 @@
         </w:numPr>
       </w:pPr>
       <w:r>
-        <w:t xml:space="preserve">Pandas, </w:t>
-      </w:r>
-      <w:proofErr w:type="spellStart"/>
-      <w:r>
-        <w:t>numpy</w:t>
-      </w:r>
-      <w:proofErr w:type="spellEnd"/>
-      <w:r>
-        <w:t>, scikit-learn</w:t>
+        <w:t>Pandas, numpy, scikit-learn</w:t>
       </w:r>
     </w:p>
     <w:p>
@@ -100,39 +92,33 @@
           <w:numId w:val="1"/>
         </w:numPr>
       </w:pPr>
-      <w:proofErr w:type="spellStart"/>
       <w:r>
         <w:t>PyTorch</w:t>
       </w:r>
-      <w:proofErr w:type="spellEnd"/>
-    </w:p>
-    <w:p>
-      <w:pPr>
-        <w:pStyle w:val="ListParagraph"/>
-        <w:numPr>
-          <w:ilvl w:val="1"/>
-          <w:numId w:val="1"/>
-        </w:numPr>
-      </w:pPr>
-      <w:proofErr w:type="spellStart"/>
+    </w:p>
+    <w:p>
+      <w:pPr>
+        <w:pStyle w:val="ListParagraph"/>
+        <w:numPr>
+          <w:ilvl w:val="1"/>
+          <w:numId w:val="1"/>
+        </w:numPr>
+      </w:pPr>
       <w:r>
         <w:t>Tqdm</w:t>
       </w:r>
-      <w:proofErr w:type="spellEnd"/>
-    </w:p>
-    <w:p>
-      <w:pPr>
-        <w:pStyle w:val="ListParagraph"/>
-        <w:numPr>
-          <w:ilvl w:val="1"/>
-          <w:numId w:val="1"/>
-        </w:numPr>
-      </w:pPr>
-      <w:proofErr w:type="spellStart"/>
+    </w:p>
+    <w:p>
+      <w:pPr>
+        <w:pStyle w:val="ListParagraph"/>
+        <w:numPr>
+          <w:ilvl w:val="1"/>
+          <w:numId w:val="1"/>
+        </w:numPr>
+      </w:pPr>
       <w:r>
         <w:t>Joblib</w:t>
       </w:r>
-      <w:proofErr w:type="spellEnd"/>
     </w:p>
     <w:p>
       <w:pPr>
@@ -167,13 +153,8 @@
         </w:numPr>
       </w:pPr>
       <w:r>
-        <w:t xml:space="preserve">External test data: </w:t>
-      </w:r>
-      <w:proofErr w:type="spellStart"/>
-      <w:r>
-        <w:t>PhiUSIIL</w:t>
-      </w:r>
-      <w:proofErr w:type="spellEnd"/>
+        <w:t>External test data: PhiUSIIL</w:t>
+      </w:r>
     </w:p>
     <w:p>
       <w:pPr>
@@ -238,13 +219,8 @@
         <w:t xml:space="preserve">70% </w:t>
       </w:r>
       <w:r>
-        <w:t xml:space="preserve">/ </w:t>
-      </w:r>
-      <w:proofErr w:type="spellStart"/>
-      <w:r>
-        <w:t>val</w:t>
-      </w:r>
-      <w:proofErr w:type="spellEnd"/>
+        <w:t>/ val</w:t>
+      </w:r>
       <w:r>
         <w:t xml:space="preserve"> 15%</w:t>
       </w:r>
@@ -741,15 +717,7 @@
         </w:numPr>
       </w:pPr>
       <w:r>
-        <w:t xml:space="preserve">Output train / </w:t>
-      </w:r>
-      <w:proofErr w:type="spellStart"/>
-      <w:r>
-        <w:t>val</w:t>
-      </w:r>
-      <w:proofErr w:type="spellEnd"/>
-      <w:r>
-        <w:t xml:space="preserve"> / test</w:t>
+        <w:t>Output train / val / test</w:t>
       </w:r>
     </w:p>
     <w:p>
@@ -1075,15 +1043,7 @@
     </w:p>
     <w:p>
       <w:r>
-        <w:t xml:space="preserve">First version only </w:t>
-      </w:r>
-      <w:proofErr w:type="gramStart"/>
-      <w:r>
-        <w:t>need</w:t>
-      </w:r>
-      <w:proofErr w:type="gramEnd"/>
-      <w:r>
-        <w:t>:</w:t>
+        <w:t>First version only need:</w:t>
       </w:r>
     </w:p>
     <w:p>
@@ -1107,15 +1067,7 @@
         </w:numPr>
       </w:pPr>
       <w:r>
-        <w:t>1–</w:t>
-      </w:r>
-      <w:proofErr w:type="gramStart"/>
-      <w:r>
-        <w:t>3 layer</w:t>
-      </w:r>
-      <w:proofErr w:type="gramEnd"/>
-      <w:r>
-        <w:t xml:space="preserve"> TCN block</w:t>
+        <w:t>1–3 layer TCN block</w:t>
       </w:r>
     </w:p>
     <w:p>
@@ -1434,77 +1386,19 @@
         <w:rPr>
           <w:color w:val="FF0000"/>
         </w:rPr>
-        <w:t xml:space="preserve">Cannot use </w:t>
-      </w:r>
-      <w:proofErr w:type="spellStart"/>
-      <w:r>
+        <w:t>Cannot use PhiUSIIL datasert cuz overlap with Kaggle dataset</w:t>
+      </w:r>
+    </w:p>
+    <w:p>
+      <w:pPr>
         <w:rPr>
           <w:color w:val="FF0000"/>
         </w:rPr>
-        <w:t>PhiUSIIL</w:t>
-      </w:r>
-      <w:proofErr w:type="spellEnd"/>
-      <w:r>
-        <w:rPr>
-          <w:color w:val="FF0000"/>
-        </w:rPr>
-        <w:t xml:space="preserve"> </w:t>
-      </w:r>
-      <w:proofErr w:type="spellStart"/>
-      <w:r>
-        <w:rPr>
-          <w:color w:val="FF0000"/>
-        </w:rPr>
-        <w:t>datasert</w:t>
-      </w:r>
-      <w:proofErr w:type="spellEnd"/>
-      <w:r>
-        <w:rPr>
-          <w:color w:val="FF0000"/>
-        </w:rPr>
-        <w:t xml:space="preserve"> </w:t>
-      </w:r>
-      <w:proofErr w:type="spellStart"/>
-      <w:r>
-        <w:rPr>
-          <w:color w:val="FF0000"/>
-        </w:rPr>
-        <w:t>cuz</w:t>
-      </w:r>
-      <w:proofErr w:type="spellEnd"/>
-      <w:r>
-        <w:rPr>
-          <w:color w:val="FF0000"/>
-        </w:rPr>
-        <w:t xml:space="preserve"> overlap with Kaggle dataset</w:t>
-      </w:r>
-    </w:p>
-    <w:p>
-      <w:pPr>
-        <w:rPr>
-          <w:color w:val="FF0000"/>
-        </w:rPr>
-      </w:pPr>
-    </w:p>
-    <w:p>
-      <w:r>
-        <w:t xml:space="preserve">In this dataset, the presence of HTTPS appeared to be a strong discriminative feature. However, HTTPS alone should not be interpreted as a guarantee of </w:t>
-      </w:r>
-      <w:proofErr w:type="gramStart"/>
-      <w:r>
-        <w:t>legitimacy, since</w:t>
-      </w:r>
-      <w:proofErr w:type="gramEnd"/>
-      <w:r>
-        <w:t xml:space="preserve"> phishing websites may also use HTTPS. (</w:t>
-      </w:r>
-      <w:proofErr w:type="gramStart"/>
-      <w:r>
-        <w:t>from</w:t>
-      </w:r>
-      <w:proofErr w:type="gramEnd"/>
-      <w:r>
-        <w:t xml:space="preserve"> analyze_rf.py)</w:t>
+      </w:pPr>
+    </w:p>
+    <w:p>
+      <w:r>
+        <w:t>In this dataset, the presence of HTTPS appeared to be a strong discriminative feature. However, HTTPS alone should not be interpreted as a guarantee of legitimacy, since phishing websites may also use HTTPS. (from analyze_rf.py)</w:t>
       </w:r>
     </w:p>
     <w:p/>
@@ -1754,6 +1648,9 @@
         <w:ind w:left="360"/>
       </w:pPr>
       <w:r>
+        <w:rPr>
+          <w:noProof/>
+        </w:rPr>
         <w:drawing>
           <wp:inline distT="0" distB="0" distL="0" distR="0" wp14:anchorId="5A2A4734" wp14:editId="64EA7F28">
             <wp:extent cx="5731510" cy="3550285"/>
@@ -1801,6 +1698,9 @@
         <w:ind w:left="360"/>
       </w:pPr>
       <w:r>
+        <w:rPr>
+          <w:noProof/>
+        </w:rPr>
         <w:lastRenderedPageBreak/>
         <w:drawing>
           <wp:inline distT="0" distB="0" distL="0" distR="0" wp14:anchorId="09296C21" wp14:editId="39C08A19">
@@ -1827,6 +1727,61 @@
                     <a:xfrm>
                       <a:off x="0" y="0"/>
                       <a:ext cx="5731510" cy="4119245"/>
+                    </a:xfrm>
+                    <a:prstGeom prst="rect">
+                      <a:avLst/>
+                    </a:prstGeom>
+                  </pic:spPr>
+                </pic:pic>
+              </a:graphicData>
+            </a:graphic>
+          </wp:inline>
+        </w:drawing>
+      </w:r>
+    </w:p>
+    <w:p>
+      <w:pPr>
+        <w:ind w:left="360"/>
+      </w:pPr>
+    </w:p>
+    <w:p>
+      <w:pPr>
+        <w:ind w:left="360"/>
+        <w:rPr>
+          <w:b/>
+          <w:bCs/>
+        </w:rPr>
+      </w:pPr>
+      <w:r>
+        <w:rPr>
+          <w:b/>
+          <w:bCs/>
+        </w:rPr>
+        <w:drawing>
+          <wp:inline distT="0" distB="0" distL="0" distR="0" wp14:anchorId="2BA59578" wp14:editId="042D558B">
+            <wp:extent cx="5731510" cy="2519680"/>
+            <wp:effectExtent l="0" t="0" r="2540" b="0"/>
+            <wp:docPr id="10" name="Picture 10"/>
+            <wp:cNvGraphicFramePr>
+              <a:graphicFrameLocks xmlns:a="http://schemas.openxmlformats.org/drawingml/2006/main" noChangeAspect="1"/>
+            </wp:cNvGraphicFramePr>
+            <a:graphic xmlns:a="http://schemas.openxmlformats.org/drawingml/2006/main">
+              <a:graphicData uri="http://schemas.openxmlformats.org/drawingml/2006/picture">
+                <pic:pic xmlns:pic="http://schemas.openxmlformats.org/drawingml/2006/picture">
+                  <pic:nvPicPr>
+                    <pic:cNvPr id="1" name=""/>
+                    <pic:cNvPicPr/>
+                  </pic:nvPicPr>
+                  <pic:blipFill>
+                    <a:blip r:embed="rId17"/>
+                    <a:stretch>
+                      <a:fillRect/>
+                    </a:stretch>
+                  </pic:blipFill>
+                  <pic:spPr>
+                    <a:xfrm>
+                      <a:off x="0" y="0"/>
+                      <a:ext cx="5731510" cy="2519680"/>
                     </a:xfrm>
                     <a:prstGeom prst="rect">
                       <a:avLst/>

</xml_diff>